<commit_message>
Update model loading logic, retry smoke test, and finalize project documentation
</commit_message>
<xml_diff>
--- a/2024AD05449_MlOps_Assignment2.docx
+++ b/2024AD05449_MlOps_Assignment2.docx
@@ -484,6 +484,9 @@
         </w:rPr>
       </w:pPr>
       <w:r>
+        <w:rPr>
+          <w:noProof/>
+        </w:rPr>
         <w:drawing>
           <wp:inline distT="0" distB="0" distL="0" distR="0" wp14:anchorId="08A3E07A" wp14:editId="11E75BE0">
             <wp:extent cx="5731510" cy="1344930"/>
@@ -1055,6 +1058,9 @@
         </w:rPr>
       </w:pPr>
       <w:r>
+        <w:rPr>
+          <w:noProof/>
+        </w:rPr>
         <w:lastRenderedPageBreak/>
         <w:drawing>
           <wp:inline distT="0" distB="0" distL="0" distR="0" wp14:anchorId="2EACF772" wp14:editId="3C9D8CF5">
@@ -1380,6 +1386,9 @@
         </w:rPr>
       </w:pPr>
       <w:r>
+        <w:rPr>
+          <w:noProof/>
+        </w:rPr>
         <w:drawing>
           <wp:inline distT="0" distB="0" distL="0" distR="0" wp14:anchorId="1DC253B6" wp14:editId="43123D5E">
             <wp:extent cx="5731510" cy="3187065"/>
@@ -1663,6 +1672,7 @@
       </w:pPr>
       <w:r>
         <w:rPr>
+          <w:noProof/>
           <w:u w:val="single"/>
         </w:rPr>
         <w:drawing>
@@ -1702,6 +1712,825 @@
         </w:drawing>
       </w:r>
     </w:p>
+    <w:p>
+      <w:pPr>
+        <w:pBdr>
+          <w:bottom w:val="single" w:sz="12" w:space="1" w:color="auto"/>
+        </w:pBdr>
+        <w:rPr>
+          <w:u w:val="single"/>
+        </w:rPr>
+      </w:pPr>
+    </w:p>
+    <w:p>
+      <w:pPr>
+        <w:pBdr>
+          <w:bottom w:val="single" w:sz="12" w:space="1" w:color="auto"/>
+        </w:pBdr>
+        <w:rPr>
+          <w:u w:val="single"/>
+        </w:rPr>
+      </w:pPr>
+    </w:p>
+    <w:p>
+      <w:pPr>
+        <w:pStyle w:val="NormalWeb"/>
+        <w:rPr>
+          <w:color w:val="000000"/>
+        </w:rPr>
+      </w:pPr>
+      <w:r>
+        <w:rPr>
+          <w:b/>
+          <w:bCs/>
+          <w:color w:val="000000"/>
+        </w:rPr>
+        <w:t>5. Automated Testing &amp; Continuous Integration (CI)</w:t>
+      </w:r>
+      <w:r>
+        <w:rPr>
+          <w:rStyle w:val="apple-converted-space"/>
+          <w:color w:val="000000"/>
+        </w:rPr>
+        <w:t> </w:t>
+      </w:r>
+      <w:r>
+        <w:rPr>
+          <w:color w:val="000000"/>
+        </w:rPr>
+        <w:t>Unit tests were implemented using</w:t>
+      </w:r>
+      <w:r>
+        <w:rPr>
+          <w:rStyle w:val="apple-converted-space"/>
+          <w:color w:val="000000"/>
+        </w:rPr>
+        <w:t> </w:t>
+      </w:r>
+      <w:proofErr w:type="spellStart"/>
+      <w:r>
+        <w:rPr>
+          <w:rStyle w:val="HTMLCode"/>
+          <w:color w:val="000000"/>
+        </w:rPr>
+        <w:t>pytest</w:t>
+      </w:r>
+      <w:proofErr w:type="spellEnd"/>
+      <w:r>
+        <w:rPr>
+          <w:rStyle w:val="apple-converted-space"/>
+          <w:color w:val="000000"/>
+        </w:rPr>
+        <w:t> </w:t>
+      </w:r>
+      <w:r>
+        <w:rPr>
+          <w:color w:val="000000"/>
+        </w:rPr>
+        <w:t xml:space="preserve">to validate data </w:t>
+      </w:r>
+      <w:proofErr w:type="spellStart"/>
+      <w:r>
+        <w:rPr>
+          <w:color w:val="000000"/>
+        </w:rPr>
+        <w:t>preprocessing</w:t>
+      </w:r>
+      <w:proofErr w:type="spellEnd"/>
+      <w:r>
+        <w:rPr>
+          <w:color w:val="000000"/>
+        </w:rPr>
+        <w:t xml:space="preserve"> pipeline dimensions and image transformations. An automated CI workflow was configured via GitHub Actions to run tests and verify container builds on every push to the</w:t>
+      </w:r>
+      <w:r>
+        <w:rPr>
+          <w:rStyle w:val="apple-converted-space"/>
+          <w:color w:val="000000"/>
+        </w:rPr>
+        <w:t> </w:t>
+      </w:r>
+      <w:r>
+        <w:rPr>
+          <w:rStyle w:val="HTMLCode"/>
+          <w:color w:val="000000"/>
+        </w:rPr>
+        <w:t>main</w:t>
+      </w:r>
+      <w:r>
+        <w:rPr>
+          <w:rStyle w:val="apple-converted-space"/>
+          <w:color w:val="000000"/>
+        </w:rPr>
+        <w:t> </w:t>
+      </w:r>
+      <w:r>
+        <w:rPr>
+          <w:color w:val="000000"/>
+        </w:rPr>
+        <w:t>branch.</w:t>
+      </w:r>
+    </w:p>
+    <w:p>
+      <w:pPr>
+        <w:pStyle w:val="NormalWeb"/>
+        <w:numPr>
+          <w:ilvl w:val="0"/>
+          <w:numId w:val="4"/>
+        </w:numPr>
+        <w:rPr>
+          <w:color w:val="000000"/>
+        </w:rPr>
+      </w:pPr>
+      <w:r>
+        <w:rPr>
+          <w:b/>
+          <w:bCs/>
+          <w:color w:val="000000"/>
+        </w:rPr>
+        <w:t>Unit Testing:</w:t>
+      </w:r>
+      <w:r>
+        <w:rPr>
+          <w:rStyle w:val="apple-converted-space"/>
+          <w:color w:val="000000"/>
+        </w:rPr>
+        <w:t> </w:t>
+      </w:r>
+      <w:r>
+        <w:rPr>
+          <w:color w:val="000000"/>
+        </w:rPr>
+        <w:t>Executed</w:t>
+      </w:r>
+      <w:r>
+        <w:rPr>
+          <w:rStyle w:val="apple-converted-space"/>
+          <w:color w:val="000000"/>
+        </w:rPr>
+        <w:t> </w:t>
+      </w:r>
+      <w:proofErr w:type="spellStart"/>
+      <w:r>
+        <w:rPr>
+          <w:rStyle w:val="HTMLCode"/>
+          <w:color w:val="000000"/>
+        </w:rPr>
+        <w:t>pytest</w:t>
+      </w:r>
+      <w:proofErr w:type="spellEnd"/>
+      <w:r>
+        <w:rPr>
+          <w:rStyle w:val="HTMLCode"/>
+          <w:color w:val="000000"/>
+        </w:rPr>
+        <w:t xml:space="preserve"> tests/</w:t>
+      </w:r>
+      <w:r>
+        <w:rPr>
+          <w:rStyle w:val="apple-converted-space"/>
+          <w:color w:val="000000"/>
+        </w:rPr>
+        <w:t> </w:t>
+      </w:r>
+      <w:r>
+        <w:rPr>
+          <w:color w:val="000000"/>
+        </w:rPr>
+        <w:t>(2 tests passed).</w:t>
+      </w:r>
+    </w:p>
+    <w:p>
+      <w:pPr>
+        <w:pStyle w:val="NormalWeb"/>
+        <w:numPr>
+          <w:ilvl w:val="0"/>
+          <w:numId w:val="4"/>
+        </w:numPr>
+        <w:rPr>
+          <w:color w:val="000000"/>
+        </w:rPr>
+      </w:pPr>
+      <w:r>
+        <w:rPr>
+          <w:b/>
+          <w:bCs/>
+          <w:color w:val="000000"/>
+        </w:rPr>
+        <w:t>CI Workflow:</w:t>
+      </w:r>
+      <w:r>
+        <w:rPr>
+          <w:rStyle w:val="apple-converted-space"/>
+          <w:color w:val="000000"/>
+        </w:rPr>
+        <w:t> </w:t>
+      </w:r>
+      <w:r>
+        <w:rPr>
+          <w:color w:val="000000"/>
+        </w:rPr>
+        <w:t>Configured</w:t>
+      </w:r>
+      <w:r>
+        <w:rPr>
+          <w:rStyle w:val="apple-converted-space"/>
+          <w:color w:val="000000"/>
+        </w:rPr>
+        <w:t> </w:t>
+      </w:r>
+      <w:r>
+        <w:rPr>
+          <w:rStyle w:val="HTMLCode"/>
+          <w:color w:val="000000"/>
+        </w:rPr>
+        <w:t>.</w:t>
+      </w:r>
+      <w:proofErr w:type="spellStart"/>
+      <w:r>
+        <w:rPr>
+          <w:rStyle w:val="HTMLCode"/>
+          <w:color w:val="000000"/>
+        </w:rPr>
+        <w:t>github</w:t>
+      </w:r>
+      <w:proofErr w:type="spellEnd"/>
+      <w:r>
+        <w:rPr>
+          <w:rStyle w:val="HTMLCode"/>
+          <w:color w:val="000000"/>
+        </w:rPr>
+        <w:t>/workflows/</w:t>
+      </w:r>
+      <w:proofErr w:type="spellStart"/>
+      <w:r>
+        <w:rPr>
+          <w:rStyle w:val="HTMLCode"/>
+          <w:color w:val="000000"/>
+        </w:rPr>
+        <w:t>ci.yml</w:t>
+      </w:r>
+      <w:proofErr w:type="spellEnd"/>
+      <w:r>
+        <w:rPr>
+          <w:rStyle w:val="apple-converted-space"/>
+          <w:color w:val="000000"/>
+        </w:rPr>
+        <w:t> </w:t>
+      </w:r>
+      <w:r>
+        <w:rPr>
+          <w:color w:val="000000"/>
+        </w:rPr>
+        <w:t>for automated linting, testing, and Docker image builds.</w:t>
+      </w:r>
+    </w:p>
+    <w:p>
+      <w:pPr>
+        <w:pStyle w:val="NormalWeb"/>
+        <w:rPr>
+          <w:i/>
+          <w:iCs/>
+          <w:color w:val="000000"/>
+        </w:rPr>
+      </w:pPr>
+      <w:r>
+        <w:drawing>
+          <wp:inline distT="0" distB="0" distL="0" distR="0" wp14:anchorId="239F6D01" wp14:editId="362587BF">
+            <wp:extent cx="5731510" cy="1080770"/>
+            <wp:effectExtent l="0" t="0" r="0" b="0"/>
+            <wp:docPr id="331119069" name="Picture 1"/>
+            <wp:cNvGraphicFramePr>
+              <a:graphicFrameLocks xmlns:a="http://schemas.openxmlformats.org/drawingml/2006/main" noChangeAspect="1"/>
+            </wp:cNvGraphicFramePr>
+            <a:graphic xmlns:a="http://schemas.openxmlformats.org/drawingml/2006/main">
+              <a:graphicData uri="http://schemas.openxmlformats.org/drawingml/2006/picture">
+                <pic:pic xmlns:pic="http://schemas.openxmlformats.org/drawingml/2006/picture">
+                  <pic:nvPicPr>
+                    <pic:cNvPr id="1711686321" name=""/>
+                    <pic:cNvPicPr/>
+                  </pic:nvPicPr>
+                  <pic:blipFill>
+                    <a:blip r:embed="rId10"/>
+                    <a:stretch>
+                      <a:fillRect/>
+                    </a:stretch>
+                  </pic:blipFill>
+                  <pic:spPr>
+                    <a:xfrm>
+                      <a:off x="0" y="0"/>
+                      <a:ext cx="5731510" cy="1080770"/>
+                    </a:xfrm>
+                    <a:prstGeom prst="rect">
+                      <a:avLst/>
+                    </a:prstGeom>
+                  </pic:spPr>
+                </pic:pic>
+              </a:graphicData>
+            </a:graphic>
+          </wp:inline>
+        </w:drawing>
+      </w:r>
+      <w:r>
+        <w:rPr>
+          <w:i/>
+          <w:iCs/>
+          <w:color w:val="000000"/>
+        </w:rPr>
+        <w:t xml:space="preserve"> </w:t>
+      </w:r>
+      <w:r>
+        <w:rPr>
+          <w:u w:val="single"/>
+        </w:rPr>
+        <w:drawing>
+          <wp:inline distT="0" distB="0" distL="0" distR="0" wp14:anchorId="46388EE1" wp14:editId="02CE294E">
+            <wp:extent cx="5731510" cy="1917065"/>
+            <wp:effectExtent l="0" t="0" r="0" b="635"/>
+            <wp:docPr id="1489124274" name="Picture 1"/>
+            <wp:cNvGraphicFramePr>
+              <a:graphicFrameLocks xmlns:a="http://schemas.openxmlformats.org/drawingml/2006/main" noChangeAspect="1"/>
+            </wp:cNvGraphicFramePr>
+            <a:graphic xmlns:a="http://schemas.openxmlformats.org/drawingml/2006/main">
+              <a:graphicData uri="http://schemas.openxmlformats.org/drawingml/2006/picture">
+                <pic:pic xmlns:pic="http://schemas.openxmlformats.org/drawingml/2006/picture">
+                  <pic:nvPicPr>
+                    <pic:cNvPr id="991431464" name=""/>
+                    <pic:cNvPicPr/>
+                  </pic:nvPicPr>
+                  <pic:blipFill>
+                    <a:blip r:embed="rId11"/>
+                    <a:stretch>
+                      <a:fillRect/>
+                    </a:stretch>
+                  </pic:blipFill>
+                  <pic:spPr>
+                    <a:xfrm>
+                      <a:off x="0" y="0"/>
+                      <a:ext cx="5731510" cy="1917065"/>
+                    </a:xfrm>
+                    <a:prstGeom prst="rect">
+                      <a:avLst/>
+                    </a:prstGeom>
+                  </pic:spPr>
+                </pic:pic>
+              </a:graphicData>
+            </a:graphic>
+          </wp:inline>
+        </w:drawing>
+      </w:r>
+    </w:p>
+    <w:p>
+      <w:pPr>
+        <w:pStyle w:val="NormalWeb"/>
+        <w:rPr>
+          <w:color w:val="000000"/>
+        </w:rPr>
+      </w:pPr>
+      <w:r>
+        <w:rPr>
+          <w:u w:val="single"/>
+        </w:rPr>
+        <w:lastRenderedPageBreak/>
+        <w:drawing>
+          <wp:inline distT="0" distB="0" distL="0" distR="0" wp14:anchorId="2B88A3BB" wp14:editId="33FE0B29">
+            <wp:extent cx="5731510" cy="3037205"/>
+            <wp:effectExtent l="0" t="0" r="0" b="0"/>
+            <wp:docPr id="504961451" name="Picture 1"/>
+            <wp:cNvGraphicFramePr>
+              <a:graphicFrameLocks xmlns:a="http://schemas.openxmlformats.org/drawingml/2006/main" noChangeAspect="1"/>
+            </wp:cNvGraphicFramePr>
+            <a:graphic xmlns:a="http://schemas.openxmlformats.org/drawingml/2006/main">
+              <a:graphicData uri="http://schemas.openxmlformats.org/drawingml/2006/picture">
+                <pic:pic xmlns:pic="http://schemas.openxmlformats.org/drawingml/2006/picture">
+                  <pic:nvPicPr>
+                    <pic:cNvPr id="2078233725" name=""/>
+                    <pic:cNvPicPr/>
+                  </pic:nvPicPr>
+                  <pic:blipFill>
+                    <a:blip r:embed="rId12"/>
+                    <a:stretch>
+                      <a:fillRect/>
+                    </a:stretch>
+                  </pic:blipFill>
+                  <pic:spPr>
+                    <a:xfrm>
+                      <a:off x="0" y="0"/>
+                      <a:ext cx="5731510" cy="3037205"/>
+                    </a:xfrm>
+                    <a:prstGeom prst="rect">
+                      <a:avLst/>
+                    </a:prstGeom>
+                  </pic:spPr>
+                </pic:pic>
+              </a:graphicData>
+            </a:graphic>
+          </wp:inline>
+        </w:drawing>
+      </w:r>
+    </w:p>
+    <w:p>
+      <w:pPr>
+        <w:pStyle w:val="NormalWeb"/>
+        <w:rPr>
+          <w:color w:val="000000"/>
+        </w:rPr>
+      </w:pPr>
+      <w:r>
+        <w:rPr>
+          <w:b/>
+          <w:bCs/>
+          <w:color w:val="000000"/>
+        </w:rPr>
+        <w:t>6. Deployment, Health Smoke Testing &amp; Monitoring (M4 &amp; M5)</w:t>
+      </w:r>
+      <w:r>
+        <w:rPr>
+          <w:rStyle w:val="apple-converted-space"/>
+          <w:color w:val="000000"/>
+        </w:rPr>
+        <w:t> </w:t>
+      </w:r>
+      <w:r>
+        <w:rPr>
+          <w:color w:val="000000"/>
+        </w:rPr>
+        <w:t>Infrastructure deployment was configured using</w:t>
+      </w:r>
+      <w:r>
+        <w:rPr>
+          <w:rStyle w:val="apple-converted-space"/>
+          <w:color w:val="000000"/>
+        </w:rPr>
+        <w:t> </w:t>
+      </w:r>
+      <w:r>
+        <w:rPr>
+          <w:rStyle w:val="HTMLCode"/>
+          <w:color w:val="000000"/>
+        </w:rPr>
+        <w:t>docker-</w:t>
+      </w:r>
+      <w:proofErr w:type="spellStart"/>
+      <w:r>
+        <w:rPr>
+          <w:rStyle w:val="HTMLCode"/>
+          <w:color w:val="000000"/>
+        </w:rPr>
+        <w:t>compose.yml</w:t>
+      </w:r>
+      <w:proofErr w:type="spellEnd"/>
+      <w:r>
+        <w:rPr>
+          <w:rStyle w:val="apple-converted-space"/>
+          <w:color w:val="000000"/>
+        </w:rPr>
+        <w:t> </w:t>
+      </w:r>
+      <w:r>
+        <w:rPr>
+          <w:color w:val="000000"/>
+        </w:rPr>
+        <w:t xml:space="preserve">to orchestrate service delivery. The </w:t>
+      </w:r>
+      <w:proofErr w:type="spellStart"/>
+      <w:r>
+        <w:rPr>
+          <w:color w:val="000000"/>
+        </w:rPr>
+        <w:t>FastAPI</w:t>
+      </w:r>
+      <w:proofErr w:type="spellEnd"/>
+      <w:r>
+        <w:rPr>
+          <w:color w:val="000000"/>
+        </w:rPr>
+        <w:t xml:space="preserve"> application incorporates an explicit</w:t>
+      </w:r>
+      <w:r>
+        <w:rPr>
+          <w:rStyle w:val="apple-converted-space"/>
+          <w:color w:val="000000"/>
+        </w:rPr>
+        <w:t> </w:t>
+      </w:r>
+      <w:r>
+        <w:rPr>
+          <w:rStyle w:val="HTMLCode"/>
+          <w:color w:val="000000"/>
+        </w:rPr>
+        <w:t>/health</w:t>
+      </w:r>
+      <w:r>
+        <w:rPr>
+          <w:rStyle w:val="apple-converted-space"/>
+          <w:color w:val="000000"/>
+        </w:rPr>
+        <w:t> </w:t>
+      </w:r>
+      <w:r>
+        <w:rPr>
+          <w:color w:val="000000"/>
+        </w:rPr>
+        <w:t>endpoint and structured request/latency logging. Post-deployment integrity is verified using an automated smoke testing script.</w:t>
+      </w:r>
+    </w:p>
+    <w:p>
+      <w:pPr>
+        <w:pStyle w:val="NormalWeb"/>
+        <w:numPr>
+          <w:ilvl w:val="0"/>
+          <w:numId w:val="5"/>
+        </w:numPr>
+        <w:rPr>
+          <w:color w:val="000000"/>
+        </w:rPr>
+      </w:pPr>
+      <w:r>
+        <w:rPr>
+          <w:b/>
+          <w:bCs/>
+          <w:color w:val="000000"/>
+        </w:rPr>
+        <w:t>Deployment Manifest:</w:t>
+      </w:r>
+      <w:r>
+        <w:rPr>
+          <w:rStyle w:val="apple-converted-space"/>
+          <w:color w:val="000000"/>
+        </w:rPr>
+        <w:t> </w:t>
+      </w:r>
+      <w:r>
+        <w:rPr>
+          <w:rStyle w:val="HTMLCode"/>
+          <w:color w:val="000000"/>
+        </w:rPr>
+        <w:t>docker-</w:t>
+      </w:r>
+      <w:proofErr w:type="spellStart"/>
+      <w:r>
+        <w:rPr>
+          <w:rStyle w:val="HTMLCode"/>
+          <w:color w:val="000000"/>
+        </w:rPr>
+        <w:t>compose.yml</w:t>
+      </w:r>
+      <w:proofErr w:type="spellEnd"/>
+      <w:r>
+        <w:rPr>
+          <w:rStyle w:val="apple-converted-space"/>
+          <w:color w:val="000000"/>
+        </w:rPr>
+        <w:t> </w:t>
+      </w:r>
+      <w:r>
+        <w:rPr>
+          <w:color w:val="000000"/>
+        </w:rPr>
+        <w:t>mapping exposed port</w:t>
+      </w:r>
+      <w:r>
+        <w:rPr>
+          <w:rStyle w:val="apple-converted-space"/>
+          <w:color w:val="000000"/>
+        </w:rPr>
+        <w:t> </w:t>
+      </w:r>
+      <w:r>
+        <w:rPr>
+          <w:rStyle w:val="HTMLCode"/>
+          <w:color w:val="000000"/>
+        </w:rPr>
+        <w:t>8000:8000</w:t>
+      </w:r>
+      <w:r>
+        <w:rPr>
+          <w:color w:val="000000"/>
+        </w:rPr>
+        <w:t>.</w:t>
+      </w:r>
+    </w:p>
+    <w:p>
+      <w:pPr>
+        <w:pStyle w:val="NormalWeb"/>
+        <w:numPr>
+          <w:ilvl w:val="0"/>
+          <w:numId w:val="5"/>
+        </w:numPr>
+        <w:rPr>
+          <w:color w:val="000000"/>
+        </w:rPr>
+      </w:pPr>
+      <w:r>
+        <w:rPr>
+          <w:b/>
+          <w:bCs/>
+          <w:color w:val="000000"/>
+        </w:rPr>
+        <w:t>Smoke Testing:</w:t>
+      </w:r>
+      <w:r>
+        <w:rPr>
+          <w:rStyle w:val="apple-converted-space"/>
+          <w:color w:val="000000"/>
+        </w:rPr>
+        <w:t> </w:t>
+      </w:r>
+      <w:r>
+        <w:rPr>
+          <w:color w:val="000000"/>
+        </w:rPr>
+        <w:t>Executed</w:t>
+      </w:r>
+      <w:r>
+        <w:rPr>
+          <w:rStyle w:val="apple-converted-space"/>
+          <w:color w:val="000000"/>
+        </w:rPr>
+        <w:t> </w:t>
+      </w:r>
+      <w:r>
+        <w:rPr>
+          <w:rStyle w:val="HTMLCode"/>
+          <w:color w:val="000000"/>
+        </w:rPr>
+        <w:t>python smoke_test.py</w:t>
+      </w:r>
+      <w:r>
+        <w:rPr>
+          <w:rStyle w:val="apple-converted-space"/>
+          <w:color w:val="000000"/>
+        </w:rPr>
+        <w:t> </w:t>
+      </w:r>
+      <w:r>
+        <w:rPr>
+          <w:color w:val="000000"/>
+        </w:rPr>
+        <w:t>confirming</w:t>
+      </w:r>
+      <w:r>
+        <w:rPr>
+          <w:rStyle w:val="apple-converted-space"/>
+          <w:color w:val="000000"/>
+        </w:rPr>
+        <w:t> </w:t>
+      </w:r>
+      <w:r>
+        <w:rPr>
+          <w:rStyle w:val="HTMLCode"/>
+          <w:color w:val="000000"/>
+        </w:rPr>
+        <w:t>/health</w:t>
+      </w:r>
+      <w:r>
+        <w:rPr>
+          <w:rStyle w:val="apple-converted-space"/>
+          <w:color w:val="000000"/>
+        </w:rPr>
+        <w:t> </w:t>
+      </w:r>
+      <w:r>
+        <w:rPr>
+          <w:color w:val="000000"/>
+        </w:rPr>
+        <w:t>endpoint status.</w:t>
+      </w:r>
+    </w:p>
+    <w:p>
+      <w:pPr>
+        <w:pStyle w:val="NormalWeb"/>
+        <w:numPr>
+          <w:ilvl w:val="0"/>
+          <w:numId w:val="5"/>
+        </w:numPr>
+        <w:rPr>
+          <w:color w:val="000000"/>
+        </w:rPr>
+      </w:pPr>
+      <w:r>
+        <w:rPr>
+          <w:b/>
+          <w:bCs/>
+          <w:color w:val="000000"/>
+        </w:rPr>
+        <w:t>Logging &amp; Monitoring:</w:t>
+      </w:r>
+      <w:r>
+        <w:rPr>
+          <w:rStyle w:val="apple-converted-space"/>
+          <w:color w:val="000000"/>
+        </w:rPr>
+        <w:t> </w:t>
+      </w:r>
+      <w:r>
+        <w:rPr>
+          <w:color w:val="000000"/>
+        </w:rPr>
+        <w:t>Request metadata, prediction labels, and latency metrics logged to standard output.</w:t>
+      </w:r>
+    </w:p>
+    <w:p>
+      <w:pPr>
+        <w:pBdr>
+          <w:bottom w:val="single" w:sz="12" w:space="1" w:color="auto"/>
+        </w:pBdr>
+        <w:rPr>
+          <w:u w:val="single"/>
+        </w:rPr>
+      </w:pPr>
+      <w:r>
+        <w:rPr>
+          <w:u w:val="single"/>
+        </w:rPr>
+        <w:drawing>
+          <wp:inline distT="0" distB="0" distL="0" distR="0" wp14:anchorId="2F907376" wp14:editId="53AA4810">
+            <wp:extent cx="5731510" cy="2280920"/>
+            <wp:effectExtent l="0" t="0" r="0" b="5080"/>
+            <wp:docPr id="2094009231" name="Picture 1"/>
+            <wp:cNvGraphicFramePr>
+              <a:graphicFrameLocks xmlns:a="http://schemas.openxmlformats.org/drawingml/2006/main" noChangeAspect="1"/>
+            </wp:cNvGraphicFramePr>
+            <a:graphic xmlns:a="http://schemas.openxmlformats.org/drawingml/2006/main">
+              <a:graphicData uri="http://schemas.openxmlformats.org/drawingml/2006/picture">
+                <pic:pic xmlns:pic="http://schemas.openxmlformats.org/drawingml/2006/picture">
+                  <pic:nvPicPr>
+                    <pic:cNvPr id="1208139612" name=""/>
+                    <pic:cNvPicPr/>
+                  </pic:nvPicPr>
+                  <pic:blipFill>
+                    <a:blip r:embed="rId13"/>
+                    <a:stretch>
+                      <a:fillRect/>
+                    </a:stretch>
+                  </pic:blipFill>
+                  <pic:spPr>
+                    <a:xfrm>
+                      <a:off x="0" y="0"/>
+                      <a:ext cx="5731510" cy="2280920"/>
+                    </a:xfrm>
+                    <a:prstGeom prst="rect">
+                      <a:avLst/>
+                    </a:prstGeom>
+                  </pic:spPr>
+                </pic:pic>
+              </a:graphicData>
+            </a:graphic>
+          </wp:inline>
+        </w:drawing>
+      </w:r>
+    </w:p>
+    <w:p>
+      <w:pPr>
+        <w:pBdr>
+          <w:bottom w:val="single" w:sz="12" w:space="1" w:color="auto"/>
+        </w:pBdr>
+        <w:rPr>
+          <w:u w:val="single"/>
+        </w:rPr>
+      </w:pPr>
+    </w:p>
+    <w:p>
+      <w:pPr>
+        <w:pBdr>
+          <w:bottom w:val="single" w:sz="12" w:space="1" w:color="auto"/>
+        </w:pBdr>
+        <w:rPr>
+          <w:u w:val="single"/>
+        </w:rPr>
+      </w:pPr>
+    </w:p>
+    <w:p>
+      <w:pPr>
+        <w:pBdr>
+          <w:bottom w:val="single" w:sz="12" w:space="1" w:color="auto"/>
+        </w:pBdr>
+        <w:rPr>
+          <w:u w:val="single"/>
+        </w:rPr>
+      </w:pPr>
+    </w:p>
+    <w:p>
+      <w:pPr>
+        <w:pBdr>
+          <w:bottom w:val="single" w:sz="12" w:space="1" w:color="auto"/>
+        </w:pBdr>
+        <w:rPr>
+          <w:u w:val="single"/>
+        </w:rPr>
+      </w:pPr>
+    </w:p>
+    <w:p>
+      <w:pPr>
+        <w:pBdr>
+          <w:bottom w:val="single" w:sz="12" w:space="1" w:color="auto"/>
+        </w:pBdr>
+        <w:rPr>
+          <w:u w:val="single"/>
+        </w:rPr>
+      </w:pPr>
+    </w:p>
     <w:sectPr>
       <w:pgSz w:w="11906" w:h="16838"/>
       <w:pgMar w:top="1440" w:right="1440" w:bottom="1440" w:left="1440" w:header="708" w:footer="708" w:gutter="0"/>
@@ -1864,6 +2693,155 @@
     </w:lvl>
   </w:abstractNum>
   <w:abstractNum w:abstractNumId="1" w15:restartNumberingAfterBreak="0">
+    <w:nsid w:val="1F5548C6"/>
+    <w:multiLevelType w:val="multilevel"/>
+    <w:tmpl w:val="0C381660"/>
+    <w:lvl w:ilvl="0">
+      <w:start w:val="1"/>
+      <w:numFmt w:val="bullet"/>
+      <w:lvlText w:val=""/>
+      <w:lvlJc w:val="left"/>
+      <w:pPr>
+        <w:tabs>
+          <w:tab w:val="num" w:pos="720"/>
+        </w:tabs>
+        <w:ind w:left="720" w:hanging="360"/>
+      </w:pPr>
+      <w:rPr>
+        <w:rFonts w:ascii="Symbol" w:hAnsi="Symbol" w:hint="default"/>
+        <w:sz w:val="20"/>
+      </w:rPr>
+    </w:lvl>
+    <w:lvl w:ilvl="1" w:tentative="1">
+      <w:start w:val="1"/>
+      <w:numFmt w:val="bullet"/>
+      <w:lvlText w:val="o"/>
+      <w:lvlJc w:val="left"/>
+      <w:pPr>
+        <w:tabs>
+          <w:tab w:val="num" w:pos="1440"/>
+        </w:tabs>
+        <w:ind w:left="1440" w:hanging="360"/>
+      </w:pPr>
+      <w:rPr>
+        <w:rFonts w:ascii="Courier New" w:hAnsi="Courier New" w:hint="default"/>
+        <w:sz w:val="20"/>
+      </w:rPr>
+    </w:lvl>
+    <w:lvl w:ilvl="2" w:tentative="1">
+      <w:start w:val="1"/>
+      <w:numFmt w:val="bullet"/>
+      <w:lvlText w:val=""/>
+      <w:lvlJc w:val="left"/>
+      <w:pPr>
+        <w:tabs>
+          <w:tab w:val="num" w:pos="2160"/>
+        </w:tabs>
+        <w:ind w:left="2160" w:hanging="360"/>
+      </w:pPr>
+      <w:rPr>
+        <w:rFonts w:ascii="Wingdings" w:hAnsi="Wingdings" w:hint="default"/>
+        <w:sz w:val="20"/>
+      </w:rPr>
+    </w:lvl>
+    <w:lvl w:ilvl="3" w:tentative="1">
+      <w:start w:val="1"/>
+      <w:numFmt w:val="bullet"/>
+      <w:lvlText w:val=""/>
+      <w:lvlJc w:val="left"/>
+      <w:pPr>
+        <w:tabs>
+          <w:tab w:val="num" w:pos="2880"/>
+        </w:tabs>
+        <w:ind w:left="2880" w:hanging="360"/>
+      </w:pPr>
+      <w:rPr>
+        <w:rFonts w:ascii="Wingdings" w:hAnsi="Wingdings" w:hint="default"/>
+        <w:sz w:val="20"/>
+      </w:rPr>
+    </w:lvl>
+    <w:lvl w:ilvl="4" w:tentative="1">
+      <w:start w:val="1"/>
+      <w:numFmt w:val="bullet"/>
+      <w:lvlText w:val=""/>
+      <w:lvlJc w:val="left"/>
+      <w:pPr>
+        <w:tabs>
+          <w:tab w:val="num" w:pos="3600"/>
+        </w:tabs>
+        <w:ind w:left="3600" w:hanging="360"/>
+      </w:pPr>
+      <w:rPr>
+        <w:rFonts w:ascii="Wingdings" w:hAnsi="Wingdings" w:hint="default"/>
+        <w:sz w:val="20"/>
+      </w:rPr>
+    </w:lvl>
+    <w:lvl w:ilvl="5" w:tentative="1">
+      <w:start w:val="1"/>
+      <w:numFmt w:val="bullet"/>
+      <w:lvlText w:val=""/>
+      <w:lvlJc w:val="left"/>
+      <w:pPr>
+        <w:tabs>
+          <w:tab w:val="num" w:pos="4320"/>
+        </w:tabs>
+        <w:ind w:left="4320" w:hanging="360"/>
+      </w:pPr>
+      <w:rPr>
+        <w:rFonts w:ascii="Wingdings" w:hAnsi="Wingdings" w:hint="default"/>
+        <w:sz w:val="20"/>
+      </w:rPr>
+    </w:lvl>
+    <w:lvl w:ilvl="6" w:tentative="1">
+      <w:start w:val="1"/>
+      <w:numFmt w:val="bullet"/>
+      <w:lvlText w:val=""/>
+      <w:lvlJc w:val="left"/>
+      <w:pPr>
+        <w:tabs>
+          <w:tab w:val="num" w:pos="5040"/>
+        </w:tabs>
+        <w:ind w:left="5040" w:hanging="360"/>
+      </w:pPr>
+      <w:rPr>
+        <w:rFonts w:ascii="Wingdings" w:hAnsi="Wingdings" w:hint="default"/>
+        <w:sz w:val="20"/>
+      </w:rPr>
+    </w:lvl>
+    <w:lvl w:ilvl="7" w:tentative="1">
+      <w:start w:val="1"/>
+      <w:numFmt w:val="bullet"/>
+      <w:lvlText w:val=""/>
+      <w:lvlJc w:val="left"/>
+      <w:pPr>
+        <w:tabs>
+          <w:tab w:val="num" w:pos="5760"/>
+        </w:tabs>
+        <w:ind w:left="5760" w:hanging="360"/>
+      </w:pPr>
+      <w:rPr>
+        <w:rFonts w:ascii="Wingdings" w:hAnsi="Wingdings" w:hint="default"/>
+        <w:sz w:val="20"/>
+      </w:rPr>
+    </w:lvl>
+    <w:lvl w:ilvl="8" w:tentative="1">
+      <w:start w:val="1"/>
+      <w:numFmt w:val="bullet"/>
+      <w:lvlText w:val=""/>
+      <w:lvlJc w:val="left"/>
+      <w:pPr>
+        <w:tabs>
+          <w:tab w:val="num" w:pos="6480"/>
+        </w:tabs>
+        <w:ind w:left="6480" w:hanging="360"/>
+      </w:pPr>
+      <w:rPr>
+        <w:rFonts w:ascii="Wingdings" w:hAnsi="Wingdings" w:hint="default"/>
+        <w:sz w:val="20"/>
+      </w:rPr>
+    </w:lvl>
+  </w:abstractNum>
+  <w:abstractNum w:abstractNumId="2" w15:restartNumberingAfterBreak="0">
     <w:nsid w:val="246042B7"/>
     <w:multiLevelType w:val="multilevel"/>
     <w:tmpl w:val="5E42A73C"/>
@@ -2012,7 +2990,156 @@
       </w:rPr>
     </w:lvl>
   </w:abstractNum>
-  <w:abstractNum w:abstractNumId="2" w15:restartNumberingAfterBreak="0">
+  <w:abstractNum w:abstractNumId="3" w15:restartNumberingAfterBreak="0">
+    <w:nsid w:val="6D774647"/>
+    <w:multiLevelType w:val="multilevel"/>
+    <w:tmpl w:val="C2FCCFE0"/>
+    <w:lvl w:ilvl="0">
+      <w:start w:val="1"/>
+      <w:numFmt w:val="bullet"/>
+      <w:lvlText w:val=""/>
+      <w:lvlJc w:val="left"/>
+      <w:pPr>
+        <w:tabs>
+          <w:tab w:val="num" w:pos="720"/>
+        </w:tabs>
+        <w:ind w:left="720" w:hanging="360"/>
+      </w:pPr>
+      <w:rPr>
+        <w:rFonts w:ascii="Symbol" w:hAnsi="Symbol" w:hint="default"/>
+        <w:sz w:val="20"/>
+      </w:rPr>
+    </w:lvl>
+    <w:lvl w:ilvl="1" w:tentative="1">
+      <w:start w:val="1"/>
+      <w:numFmt w:val="bullet"/>
+      <w:lvlText w:val="o"/>
+      <w:lvlJc w:val="left"/>
+      <w:pPr>
+        <w:tabs>
+          <w:tab w:val="num" w:pos="1440"/>
+        </w:tabs>
+        <w:ind w:left="1440" w:hanging="360"/>
+      </w:pPr>
+      <w:rPr>
+        <w:rFonts w:ascii="Courier New" w:hAnsi="Courier New" w:hint="default"/>
+        <w:sz w:val="20"/>
+      </w:rPr>
+    </w:lvl>
+    <w:lvl w:ilvl="2" w:tentative="1">
+      <w:start w:val="1"/>
+      <w:numFmt w:val="bullet"/>
+      <w:lvlText w:val=""/>
+      <w:lvlJc w:val="left"/>
+      <w:pPr>
+        <w:tabs>
+          <w:tab w:val="num" w:pos="2160"/>
+        </w:tabs>
+        <w:ind w:left="2160" w:hanging="360"/>
+      </w:pPr>
+      <w:rPr>
+        <w:rFonts w:ascii="Wingdings" w:hAnsi="Wingdings" w:hint="default"/>
+        <w:sz w:val="20"/>
+      </w:rPr>
+    </w:lvl>
+    <w:lvl w:ilvl="3" w:tentative="1">
+      <w:start w:val="1"/>
+      <w:numFmt w:val="bullet"/>
+      <w:lvlText w:val=""/>
+      <w:lvlJc w:val="left"/>
+      <w:pPr>
+        <w:tabs>
+          <w:tab w:val="num" w:pos="2880"/>
+        </w:tabs>
+        <w:ind w:left="2880" w:hanging="360"/>
+      </w:pPr>
+      <w:rPr>
+        <w:rFonts w:ascii="Wingdings" w:hAnsi="Wingdings" w:hint="default"/>
+        <w:sz w:val="20"/>
+      </w:rPr>
+    </w:lvl>
+    <w:lvl w:ilvl="4" w:tentative="1">
+      <w:start w:val="1"/>
+      <w:numFmt w:val="bullet"/>
+      <w:lvlText w:val=""/>
+      <w:lvlJc w:val="left"/>
+      <w:pPr>
+        <w:tabs>
+          <w:tab w:val="num" w:pos="3600"/>
+        </w:tabs>
+        <w:ind w:left="3600" w:hanging="360"/>
+      </w:pPr>
+      <w:rPr>
+        <w:rFonts w:ascii="Wingdings" w:hAnsi="Wingdings" w:hint="default"/>
+        <w:sz w:val="20"/>
+      </w:rPr>
+    </w:lvl>
+    <w:lvl w:ilvl="5" w:tentative="1">
+      <w:start w:val="1"/>
+      <w:numFmt w:val="bullet"/>
+      <w:lvlText w:val=""/>
+      <w:lvlJc w:val="left"/>
+      <w:pPr>
+        <w:tabs>
+          <w:tab w:val="num" w:pos="4320"/>
+        </w:tabs>
+        <w:ind w:left="4320" w:hanging="360"/>
+      </w:pPr>
+      <w:rPr>
+        <w:rFonts w:ascii="Wingdings" w:hAnsi="Wingdings" w:hint="default"/>
+        <w:sz w:val="20"/>
+      </w:rPr>
+    </w:lvl>
+    <w:lvl w:ilvl="6" w:tentative="1">
+      <w:start w:val="1"/>
+      <w:numFmt w:val="bullet"/>
+      <w:lvlText w:val=""/>
+      <w:lvlJc w:val="left"/>
+      <w:pPr>
+        <w:tabs>
+          <w:tab w:val="num" w:pos="5040"/>
+        </w:tabs>
+        <w:ind w:left="5040" w:hanging="360"/>
+      </w:pPr>
+      <w:rPr>
+        <w:rFonts w:ascii="Wingdings" w:hAnsi="Wingdings" w:hint="default"/>
+        <w:sz w:val="20"/>
+      </w:rPr>
+    </w:lvl>
+    <w:lvl w:ilvl="7" w:tentative="1">
+      <w:start w:val="1"/>
+      <w:numFmt w:val="bullet"/>
+      <w:lvlText w:val=""/>
+      <w:lvlJc w:val="left"/>
+      <w:pPr>
+        <w:tabs>
+          <w:tab w:val="num" w:pos="5760"/>
+        </w:tabs>
+        <w:ind w:left="5760" w:hanging="360"/>
+      </w:pPr>
+      <w:rPr>
+        <w:rFonts w:ascii="Wingdings" w:hAnsi="Wingdings" w:hint="default"/>
+        <w:sz w:val="20"/>
+      </w:rPr>
+    </w:lvl>
+    <w:lvl w:ilvl="8" w:tentative="1">
+      <w:start w:val="1"/>
+      <w:numFmt w:val="bullet"/>
+      <w:lvlText w:val=""/>
+      <w:lvlJc w:val="left"/>
+      <w:pPr>
+        <w:tabs>
+          <w:tab w:val="num" w:pos="6480"/>
+        </w:tabs>
+        <w:ind w:left="6480" w:hanging="360"/>
+      </w:pPr>
+      <w:rPr>
+        <w:rFonts w:ascii="Wingdings" w:hAnsi="Wingdings" w:hint="default"/>
+        <w:sz w:val="20"/>
+      </w:rPr>
+    </w:lvl>
+  </w:abstractNum>
+  <w:abstractNum w:abstractNumId="4" w15:restartNumberingAfterBreak="0">
     <w:nsid w:val="74287C12"/>
     <w:multiLevelType w:val="multilevel"/>
     <w:tmpl w:val="27345532"/>
@@ -2162,13 +3289,19 @@
     </w:lvl>
   </w:abstractNum>
   <w:num w:numId="1" w16cid:durableId="1528712762">
-    <w:abstractNumId w:val="2"/>
+    <w:abstractNumId w:val="4"/>
   </w:num>
   <w:num w:numId="2" w16cid:durableId="1896088156">
     <w:abstractNumId w:val="0"/>
   </w:num>
   <w:num w:numId="3" w16cid:durableId="284772221">
+    <w:abstractNumId w:val="2"/>
+  </w:num>
+  <w:num w:numId="4" w16cid:durableId="1605114790">
     <w:abstractNumId w:val="1"/>
+  </w:num>
+  <w:num w:numId="5" w16cid:durableId="644354670">
+    <w:abstractNumId w:val="3"/>
   </w:num>
 </w:numbering>
 </file>

</xml_diff>

<commit_message>
Final submission push: Complete MLOps pipeline, model weights, unit tests, docker manifests, and documentation
</commit_message>
<xml_diff>
--- a/2024AD05449_MlOps_Assignment2.docx
+++ b/2024AD05449_MlOps_Assignment2.docx
@@ -95,7 +95,63 @@
           <w:lang w:eastAsia="en-GB"/>
           <w14:ligatures w14:val="none"/>
         </w:rPr>
-        <w:t>Email – 04ad05449@wilp.bits-pilani.ac.in</w:t>
+        <w:t xml:space="preserve">Email – </w:t>
+      </w:r>
+      <w:r>
+        <w:rPr>
+          <w:rFonts w:ascii="Times New Roman" w:eastAsia="Times New Roman" w:hAnsi="Times New Roman" w:cs="Times New Roman"/>
+          <w:b/>
+          <w:bCs/>
+          <w:color w:val="000000"/>
+          <w:kern w:val="36"/>
+          <w:sz w:val="28"/>
+          <w:szCs w:val="28"/>
+          <w:lang w:eastAsia="en-GB"/>
+          <w14:ligatures w14:val="none"/>
+        </w:rPr>
+        <w:t>2</w:t>
+      </w:r>
+      <w:r>
+        <w:rPr>
+          <w:rFonts w:ascii="Times New Roman" w:eastAsia="Times New Roman" w:hAnsi="Times New Roman" w:cs="Times New Roman"/>
+          <w:b/>
+          <w:bCs/>
+          <w:color w:val="000000"/>
+          <w:kern w:val="36"/>
+          <w:sz w:val="28"/>
+          <w:szCs w:val="28"/>
+          <w:lang w:eastAsia="en-GB"/>
+          <w14:ligatures w14:val="none"/>
+        </w:rPr>
+        <w:t>0</w:t>
+      </w:r>
+      <w:r>
+        <w:rPr>
+          <w:rFonts w:ascii="Times New Roman" w:eastAsia="Times New Roman" w:hAnsi="Times New Roman" w:cs="Times New Roman"/>
+          <w:b/>
+          <w:bCs/>
+          <w:color w:val="000000"/>
+          <w:kern w:val="36"/>
+          <w:sz w:val="28"/>
+          <w:szCs w:val="28"/>
+          <w:lang w:eastAsia="en-GB"/>
+          <w14:ligatures w14:val="none"/>
+        </w:rPr>
+        <w:t>2</w:t>
+      </w:r>
+      <w:r>
+        <w:rPr>
+          <w:rFonts w:ascii="Times New Roman" w:eastAsia="Times New Roman" w:hAnsi="Times New Roman" w:cs="Times New Roman"/>
+          <w:b/>
+          <w:bCs/>
+          <w:color w:val="000000"/>
+          <w:kern w:val="36"/>
+          <w:sz w:val="28"/>
+          <w:szCs w:val="28"/>
+          <w:lang w:eastAsia="en-GB"/>
+          <w14:ligatures w14:val="none"/>
+        </w:rPr>
+        <w:t>4ad05449@wilp.bits-pilani.ac.in</w:t>
       </w:r>
     </w:p>
     <w:p>
@@ -142,7 +198,7 @@
           <w:lang w:eastAsia="en-GB"/>
           <w14:ligatures w14:val="none"/>
         </w:rPr>
-        <w:t xml:space="preserve"> Assignment 2: End-to-End Deep Learning Pipeline</w:t>
+        <w:t xml:space="preserve"> Assignment 2:</w:t>
       </w:r>
     </w:p>
     <w:p>
@@ -2496,40 +2552,413 @@
         <w:pBdr>
           <w:bottom w:val="single" w:sz="12" w:space="1" w:color="auto"/>
         </w:pBdr>
-        <w:rPr>
-          <w:u w:val="single"/>
-        </w:rPr>
-      </w:pPr>
+      </w:pPr>
+      <w:r>
+        <w:t>## Project Structure</w:t>
+      </w:r>
     </w:p>
     <w:p>
       <w:pPr>
         <w:pBdr>
           <w:bottom w:val="single" w:sz="12" w:space="1" w:color="auto"/>
         </w:pBdr>
-        <w:rPr>
-          <w:u w:val="single"/>
-        </w:rPr>
-      </w:pPr>
+      </w:pPr>
+      <w:r>
+        <w:t>MLOpsAssignment2/</w:t>
+      </w:r>
     </w:p>
     <w:p>
       <w:pPr>
         <w:pBdr>
           <w:bottom w:val="single" w:sz="12" w:space="1" w:color="auto"/>
         </w:pBdr>
-        <w:rPr>
-          <w:u w:val="single"/>
-        </w:rPr>
-      </w:pPr>
+      </w:pPr>
+      <w:r>
+        <w:rPr>
+          <w:rFonts w:ascii="MS Gothic" w:eastAsia="MS Gothic" w:hAnsi="MS Gothic" w:cs="MS Gothic" w:hint="eastAsia"/>
+        </w:rPr>
+        <w:t>├</w:t>
+      </w:r>
+      <w:r>
+        <w:t xml:space="preserve">── </w:t>
+      </w:r>
+      <w:proofErr w:type="spellStart"/>
+      <w:r>
+        <w:t>src</w:t>
+      </w:r>
+      <w:proofErr w:type="spellEnd"/>
+      <w:r>
+        <w:t>/</w:t>
+      </w:r>
     </w:p>
     <w:p>
       <w:pPr>
         <w:pBdr>
           <w:bottom w:val="single" w:sz="12" w:space="1" w:color="auto"/>
         </w:pBdr>
-        <w:rPr>
-          <w:u w:val="single"/>
-        </w:rPr>
-      </w:pPr>
+      </w:pPr>
+      <w:r>
+        <w:t xml:space="preserve">│   </w:t>
+      </w:r>
+      <w:r>
+        <w:rPr>
+          <w:rFonts w:ascii="MS Gothic" w:eastAsia="MS Gothic" w:hAnsi="MS Gothic" w:cs="MS Gothic" w:hint="eastAsia"/>
+        </w:rPr>
+        <w:t>├</w:t>
+      </w:r>
+      <w:r>
+        <w:t xml:space="preserve">── app.py          # </w:t>
+      </w:r>
+      <w:proofErr w:type="spellStart"/>
+      <w:r>
+        <w:t>FastAPI</w:t>
+      </w:r>
+      <w:proofErr w:type="spellEnd"/>
+      <w:r>
+        <w:t xml:space="preserve"> service</w:t>
+      </w:r>
+    </w:p>
+    <w:p>
+      <w:pPr>
+        <w:pBdr>
+          <w:bottom w:val="single" w:sz="12" w:space="1" w:color="auto"/>
+        </w:pBdr>
+      </w:pPr>
+      <w:r>
+        <w:t xml:space="preserve">│   </w:t>
+      </w:r>
+      <w:r>
+        <w:rPr>
+          <w:rFonts w:ascii="MS Gothic" w:eastAsia="MS Gothic" w:hAnsi="MS Gothic" w:cs="MS Gothic" w:hint="eastAsia"/>
+        </w:rPr>
+        <w:t>├</w:t>
+      </w:r>
+      <w:r>
+        <w:t>── train.py        # Model training</w:t>
+      </w:r>
+    </w:p>
+    <w:p>
+      <w:pPr>
+        <w:pBdr>
+          <w:bottom w:val="single" w:sz="12" w:space="1" w:color="auto"/>
+        </w:pBdr>
+      </w:pPr>
+      <w:r>
+        <w:lastRenderedPageBreak/>
+        <w:t xml:space="preserve">│   └── preprocess.py   # Data </w:t>
+      </w:r>
+      <w:proofErr w:type="spellStart"/>
+      <w:r>
+        <w:t>preprocessing</w:t>
+      </w:r>
+      <w:proofErr w:type="spellEnd"/>
+    </w:p>
+    <w:p>
+      <w:pPr>
+        <w:pBdr>
+          <w:bottom w:val="single" w:sz="12" w:space="1" w:color="auto"/>
+        </w:pBdr>
+      </w:pPr>
+      <w:r>
+        <w:rPr>
+          <w:rFonts w:ascii="MS Gothic" w:eastAsia="MS Gothic" w:hAnsi="MS Gothic" w:cs="MS Gothic" w:hint="eastAsia"/>
+        </w:rPr>
+        <w:t>├</w:t>
+      </w:r>
+      <w:r>
+        <w:t>── tests/</w:t>
+      </w:r>
+    </w:p>
+    <w:p>
+      <w:pPr>
+        <w:pBdr>
+          <w:bottom w:val="single" w:sz="12" w:space="1" w:color="auto"/>
+        </w:pBdr>
+      </w:pPr>
+      <w:r>
+        <w:t>│   └── test_pipeline.py</w:t>
+      </w:r>
+    </w:p>
+    <w:p>
+      <w:pPr>
+        <w:pBdr>
+          <w:bottom w:val="single" w:sz="12" w:space="1" w:color="auto"/>
+        </w:pBdr>
+      </w:pPr>
+      <w:r>
+        <w:rPr>
+          <w:rFonts w:ascii="MS Gothic" w:eastAsia="MS Gothic" w:hAnsi="MS Gothic" w:cs="MS Gothic" w:hint="eastAsia"/>
+        </w:rPr>
+        <w:t>├</w:t>
+      </w:r>
+      <w:r>
+        <w:t>── models/</w:t>
+      </w:r>
+    </w:p>
+    <w:p>
+      <w:pPr>
+        <w:pBdr>
+          <w:bottom w:val="single" w:sz="12" w:space="1" w:color="auto"/>
+        </w:pBdr>
+      </w:pPr>
+      <w:r>
+        <w:t xml:space="preserve">│   └── </w:t>
+      </w:r>
+      <w:proofErr w:type="spellStart"/>
+      <w:r>
+        <w:t>best_model.pth</w:t>
+      </w:r>
+      <w:proofErr w:type="spellEnd"/>
+    </w:p>
+    <w:p>
+      <w:pPr>
+        <w:pBdr>
+          <w:bottom w:val="single" w:sz="12" w:space="1" w:color="auto"/>
+        </w:pBdr>
+      </w:pPr>
+      <w:r>
+        <w:rPr>
+          <w:rFonts w:ascii="MS Gothic" w:eastAsia="MS Gothic" w:hAnsi="MS Gothic" w:cs="MS Gothic" w:hint="eastAsia"/>
+        </w:rPr>
+        <w:t>├</w:t>
+      </w:r>
+      <w:r>
+        <w:t>── data/</w:t>
+      </w:r>
+    </w:p>
+    <w:p>
+      <w:pPr>
+        <w:pBdr>
+          <w:bottom w:val="single" w:sz="12" w:space="1" w:color="auto"/>
+        </w:pBdr>
+      </w:pPr>
+      <w:r>
+        <w:t xml:space="preserve">│   </w:t>
+      </w:r>
+      <w:r>
+        <w:rPr>
+          <w:rFonts w:ascii="MS Gothic" w:eastAsia="MS Gothic" w:hAnsi="MS Gothic" w:cs="MS Gothic" w:hint="eastAsia"/>
+        </w:rPr>
+        <w:t>├</w:t>
+      </w:r>
+      <w:r>
+        <w:t>── raw/            # Original dataset (DVC tracked)</w:t>
+      </w:r>
+    </w:p>
+    <w:p>
+      <w:pPr>
+        <w:pBdr>
+          <w:bottom w:val="single" w:sz="12" w:space="1" w:color="auto"/>
+        </w:pBdr>
+      </w:pPr>
+      <w:r>
+        <w:t xml:space="preserve">│   └── processed/      # </w:t>
+      </w:r>
+      <w:proofErr w:type="spellStart"/>
+      <w:r>
+        <w:t>Preprocessed</w:t>
+      </w:r>
+      <w:proofErr w:type="spellEnd"/>
+      <w:r>
+        <w:t xml:space="preserve"> data</w:t>
+      </w:r>
+    </w:p>
+    <w:p>
+      <w:pPr>
+        <w:pBdr>
+          <w:bottom w:val="single" w:sz="12" w:space="1" w:color="auto"/>
+        </w:pBdr>
+      </w:pPr>
+      <w:r>
+        <w:rPr>
+          <w:rFonts w:ascii="MS Gothic" w:eastAsia="MS Gothic" w:hAnsi="MS Gothic" w:cs="MS Gothic" w:hint="eastAsia"/>
+        </w:rPr>
+        <w:t>├</w:t>
+      </w:r>
+      <w:r>
+        <w:t>─</w:t>
+      </w:r>
+      <w:proofErr w:type="gramStart"/>
+      <w:r>
+        <w:t>─ .</w:t>
+      </w:r>
+      <w:proofErr w:type="spellStart"/>
+      <w:r>
+        <w:t>github</w:t>
+      </w:r>
+      <w:proofErr w:type="spellEnd"/>
+      <w:proofErr w:type="gramEnd"/>
+      <w:r>
+        <w:t>/workflows/</w:t>
+      </w:r>
+    </w:p>
+    <w:p>
+      <w:pPr>
+        <w:pBdr>
+          <w:bottom w:val="single" w:sz="12" w:space="1" w:color="auto"/>
+        </w:pBdr>
+      </w:pPr>
+      <w:r>
+        <w:t xml:space="preserve">│   └── </w:t>
+      </w:r>
+      <w:proofErr w:type="spellStart"/>
+      <w:r>
+        <w:t>ci.yml</w:t>
+      </w:r>
+      <w:proofErr w:type="spellEnd"/>
+    </w:p>
+    <w:p>
+      <w:pPr>
+        <w:pBdr>
+          <w:bottom w:val="single" w:sz="12" w:space="1" w:color="auto"/>
+        </w:pBdr>
+      </w:pPr>
+      <w:r>
+        <w:rPr>
+          <w:rFonts w:ascii="MS Gothic" w:eastAsia="MS Gothic" w:hAnsi="MS Gothic" w:cs="MS Gothic" w:hint="eastAsia"/>
+        </w:rPr>
+        <w:t>├</w:t>
+      </w:r>
+      <w:r>
+        <w:t xml:space="preserve">── </w:t>
+      </w:r>
+      <w:proofErr w:type="spellStart"/>
+      <w:r>
+        <w:t>Dockerfile</w:t>
+      </w:r>
+      <w:proofErr w:type="spellEnd"/>
+    </w:p>
+    <w:p>
+      <w:pPr>
+        <w:pBdr>
+          <w:bottom w:val="single" w:sz="12" w:space="1" w:color="auto"/>
+        </w:pBdr>
+      </w:pPr>
+      <w:r>
+        <w:rPr>
+          <w:rFonts w:ascii="MS Gothic" w:eastAsia="MS Gothic" w:hAnsi="MS Gothic" w:cs="MS Gothic" w:hint="eastAsia"/>
+        </w:rPr>
+        <w:t>├</w:t>
+      </w:r>
+      <w:r>
+        <w:t>── docker-</w:t>
+      </w:r>
+      <w:proofErr w:type="spellStart"/>
+      <w:r>
+        <w:t>compose.yml</w:t>
+      </w:r>
+      <w:proofErr w:type="spellEnd"/>
+    </w:p>
+    <w:p>
+      <w:pPr>
+        <w:pBdr>
+          <w:bottom w:val="single" w:sz="12" w:space="1" w:color="auto"/>
+        </w:pBdr>
+      </w:pPr>
+      <w:r>
+        <w:rPr>
+          <w:rFonts w:ascii="MS Gothic" w:eastAsia="MS Gothic" w:hAnsi="MS Gothic" w:cs="MS Gothic" w:hint="eastAsia"/>
+        </w:rPr>
+        <w:t>├</w:t>
+      </w:r>
+      <w:r>
+        <w:t xml:space="preserve">── </w:t>
+      </w:r>
+      <w:proofErr w:type="spellStart"/>
+      <w:proofErr w:type="gramStart"/>
+      <w:r>
+        <w:t>dvc.yaml</w:t>
+      </w:r>
+      <w:proofErr w:type="spellEnd"/>
+      <w:proofErr w:type="gramEnd"/>
+    </w:p>
+    <w:p>
+      <w:pPr>
+        <w:pBdr>
+          <w:bottom w:val="single" w:sz="12" w:space="1" w:color="auto"/>
+        </w:pBdr>
+      </w:pPr>
+      <w:r>
+        <w:t>└── requirements.txt</w:t>
+      </w:r>
+    </w:p>
+    <w:p>
+      <w:pPr>
+        <w:pBdr>
+          <w:bottom w:val="single" w:sz="12" w:space="1" w:color="auto"/>
+        </w:pBdr>
+      </w:pPr>
+    </w:p>
+    <w:p>
+      <w:pPr>
+        <w:pBdr>
+          <w:bottom w:val="single" w:sz="12" w:space="1" w:color="auto"/>
+        </w:pBdr>
+      </w:pPr>
+    </w:p>
+    <w:p>
+      <w:pPr>
+        <w:pBdr>
+          <w:bottom w:val="single" w:sz="12" w:space="1" w:color="auto"/>
+        </w:pBdr>
+      </w:pPr>
+    </w:p>
+    <w:p>
+      <w:pPr>
+        <w:pBdr>
+          <w:bottom w:val="single" w:sz="12" w:space="1" w:color="auto"/>
+        </w:pBdr>
+      </w:pPr>
+    </w:p>
+    <w:p>
+      <w:pPr>
+        <w:pBdr>
+          <w:bottom w:val="single" w:sz="12" w:space="1" w:color="auto"/>
+        </w:pBdr>
+      </w:pPr>
+      <w:r>
+        <w:t>## Future Work</w:t>
+      </w:r>
+    </w:p>
+    <w:p>
+      <w:pPr>
+        <w:pBdr>
+          <w:bottom w:val="single" w:sz="12" w:space="1" w:color="auto"/>
+        </w:pBdr>
+      </w:pPr>
+      <w:r>
+        <w:t>- Implement model monitoring with Prometheus/Grafana</w:t>
+      </w:r>
+    </w:p>
+    <w:p>
+      <w:pPr>
+        <w:pBdr>
+          <w:bottom w:val="single" w:sz="12" w:space="1" w:color="auto"/>
+        </w:pBdr>
+      </w:pPr>
+      <w:r>
+        <w:t>- Add data drift detection</w:t>
+      </w:r>
+    </w:p>
+    <w:p>
+      <w:pPr>
+        <w:pBdr>
+          <w:bottom w:val="single" w:sz="12" w:space="1" w:color="auto"/>
+        </w:pBdr>
+      </w:pPr>
+      <w:r>
+        <w:t>- Deploy to cloud (AWS/GCP) with autoscaling</w:t>
+      </w:r>
+    </w:p>
+    <w:p>
+      <w:pPr>
+        <w:pBdr>
+          <w:bottom w:val="single" w:sz="12" w:space="1" w:color="auto"/>
+        </w:pBdr>
+      </w:pPr>
+      <w:r>
+        <w:t>- Use ONNX for faster inference</w:t>
+      </w:r>
     </w:p>
     <w:sectPr>
       <w:pgSz w:w="11906" w:h="16838"/>

</xml_diff>